<commit_message>
JRTIP format compliance audit (26 checks, 0 fail) + fixes: Competing Interests label, DOIs for refs [2]/[18], article number 109524->109512
</commit_message>
<xml_diff>
--- a/paper/JRTIP-paper-v5.docx
+++ b/paper/JRTIP-paper-v5.docx
@@ -3330,7 +3330,7 @@
         <w:rPr>
           <w:i w:val="0"/>
         </w:rPr>
-        <w:t>Conflicts of Interest: The authors declare no conflict of interest.</w:t>
+        <w:t>Competing Interests: The authors declare no competing interests.</w:t>
       </w:r>
     </w:p>
     <w:p>
@@ -3368,7 +3368,7 @@
         <w:rPr>
           <w:sz w:val="18"/>
         </w:rPr>
-        <w:t>[2] Peden, R.S.E., Turner, S.P., Boyle, L.A., et al.: The translation of animal welfare research into practice: the case of mixing aggression between pigs. Appl. Anim. Behav. Sci. 204, 1–9 (2018)</w:t>
+        <w:t>[2] Peden, R.S.E., Turner, S.P., Boyle, L.A., et al.: The translation of animal welfare research into practice: the case of mixing aggression between pigs. Appl. Anim. Behav. Sci. 204, 1–9 (2018). https://doi.org/10.1016/j.applanim.2018.03.003</w:t>
       </w:r>
     </w:p>
     <w:p>
@@ -3544,7 +3544,7 @@
         <w:rPr>
           <w:sz w:val="18"/>
         </w:rPr>
-        <w:t>[18] Gu, Z., He, D., Huang, J., et al.: Simultaneous detection of fruits and fruiting stems in mango using improved YOLOv8 model deployed by edge device. Comput. Electron. Agric. 227, 109524 (2024)</w:t>
+        <w:t>[18] Gu, Z., He, D., Huang, J., et al.: Simultaneous detection of fruits and fruiting stems in mango using improved YOLOv8 model deployed by edge device. Comput. Electron. Agric. 227, 109512 (2024). https://doi.org/10.1016/j.compag.2024.109512</w:t>
       </w:r>
     </w:p>
     <w:p>

</xml_diff>

<commit_message>
Humanize English v5 prose: 10 paragraph edits, zero number/citation drift, diff list for review
</commit_message>
<xml_diff>
--- a/paper/JRTIP-paper-v5.docx
+++ b/paper/JRTIP-paper-v5.docx
@@ -31,7 +31,7 @@
         <w:rPr>
           <w:i w:val="0"/>
         </w:rPr>
-        <w:t>Automated monitoring of group-housed pigs needs detectors that are accurate on rare, welfare-relevant behaviors and fast enough for low-cost edge hardware. We built a real-time multi-behavior detection framework on YOLOv11n and validated it on a Jetson Nano. Three things make the framework practical. First, a class-imbalance-aware sampling strategy based on frequency-capped offline oversampling improves rare-class detection without touching the network: the average precision of the low-frequency behavior active rises from 0.526 to 0.639 on the test set, and overall recall improves by 2.1 points on the validation set. Second, a FasterNet backbone substitution, combined with an identity-preserving integration strategy that transfers pre-trained weights by index-aligned remapping, cuts parameters by 4.4% while accuracy stays statistically comparable to the baseline across three repeated runs (test mean average precision at IoU 0.5 (mAP50) of 0.590 ± 0.009 vs. a three-seed baseline of 0.606 ± 0.008); interestingly, it is also the fastest of all models we benchmarked (117.6 frames per second (FPS) on an RTX 3090). Third, on-device validation on the Nano shows real-time operation (19.7 FPS at 640×640; 33.3 FPS at 480×480) at roughly 5 W total power. We also report a two-level generalization analysis—an unseen-sequence stress test and an independent farm dataset—that honestly delimits where the framework works and where it does not.</w:t>
+        <w:t>Automated monitoring of group-housed pigs calls for detectors that are accurate on rare, welfare-relevant behaviors yet fast enough for low-cost edge hardware. We built a real-time multi-behavior detection framework on YOLOv11n and validated it on a Jetson Nano, and three design choices carry the result. First, a class-imbalance-aware sampling strategy based on frequency-capped offline oversampling improves rare-class detection without touching the network: the average precision of the low-frequency behavior active rises from 0.526 to 0.639 on the test set, and overall recall improves by 2.1 points on the validation set. Second, a FasterNet backbone substitution—paired with an identity-preserving integration strategy that transfers pre-trained weights by index-aligned remapping—cuts parameters by 4.4% while keeping accuracy statistically comparable to the baseline across three repeated runs (test mean average precision at IoU 0.5 (mAP50) of 0.590 ± 0.009 vs. a three-seed baseline of 0.606 ± 0.008); it is also, unexpectedly, the fastest model we benchmarked (117.6 frames per second (FPS) on an RTX 3090). Third, on-device validation on the Nano confirms real-time operation (19.7 FPS at 640×640; 33.3 FPS at 480×480) at roughly 5 W total power. A two-level generalization analysis—an unseen-sequence stress test and an independent farm dataset—closes the loop by marking out where the framework works and where it does not.</w:t>
       </w:r>
     </w:p>
     <w:p>
@@ -63,7 +63,7 @@
         <w:rPr>
           <w:i w:val="0"/>
         </w:rPr>
-        <w:t>For such monitoring to be economically viable, however, detection has to run on inexpensive edge devices inside the barn. A commercial farm may operate hundreds of pens; streaming all of that video to a cloud server is impractical over rural networks, and the recurring cost of cloud inference dwarfs the one-time cost of an edge board. Latency matters as well: an alert about a fight that arrives minutes late is of little use. This is why the dominant engineering trend is to bring the detector to the data, not the other way around.</w:t>
+        <w:t>For such monitoring to pay off, detection has to run on inexpensive edge devices inside the barn. A commercial farm may operate hundreds of pens; streaming all of that video to a cloud server is impractical over rural networks, and the recurring cost of cloud inference dwarfs the one-time cost of an edge board. Latency matters too: an alert about a fight that arrives minutes late is of little use. The engineering trend therefore runs in one direction—bring the detector to the data, not the other way around.</w:t>
       </w:r>
     </w:p>
     <w:p>
@@ -127,11 +127,9 @@
         <w:rPr>
           <w:i w:val="0"/>
         </w:rPr>
-        <w:t>YOLO-based detectors have been applied to pig detection, individual tracking, posture recognition, and behavior analysis. For group-housed pigs, Tu et al. [5] combined YOLOv5s/YOLOX-S detectors with an improved DeepSORT tracker to track individual behaviors such as lying, feeding, and standing; Li et al. [6] paired YOLOX with the SCTS-SlowFast spatio-temporal module for joint detection and recognition of multiple behaviors; and more recent work proposed improved YOLOv8n and YOLOv11 variants—typically by inserting attention modules or re-designing feature-fusion paths—for standing, lying, feeding, drinking, and biting behaviors. Earlier, Alameer et al. [7] had already recognized postures and drinking behaviour for compromised-health monitoring from overhead barn footage. These works establish feasibility, but they largely assume server-side inference and balanced class distributions, and few report per-class results on rare behaviors.</w:t>
+        <w:t>YOLO-based detectors have been applied to pig detection, individual tracking, posture recognition, and behavior analysis. For group-housed pigs, Tu et al. [5] combined YOLOv5s/YOLOX-S detectors with an improved DeepSORT tracker to track individual behaviors such as lying, feeding, and standing; Li et al. [6] paired YOLOX with the SCTS-SlowFast spatio-temporal module for joint detection and recognition of multiple behaviors; and more recent work proposed improved YOLOv8n and YOLOv11 variants—typically by inserting attention modules or re-designing feature-fusion paths—for standing, lying, feeding, drinking, and biting behaviors. Earlier, Alameer et al. [7] had already recognized postures and drinking behaviour for compromised-health monitoring from overhead barn footage. These works establish feasibility, but they largely assume server-side inference and balanced class distributions, and few report per-class results on rare behaviors. Two very recent studies push the same deployment agenda with different emphases. PBR-YOLO [27] combines a GhostNet backbone, a FasterNet block with efficient multi-scale attention, and a lightweight multi-path head for eight piglet behaviors, reporting 15.8 ms per frame with TensorRT on a Jetson Orin NX—an attention-augmented design demonstrated on a board far more powerful than the Nano-class hardware we target. Rahman et al. [28] trim YOLO11n for the single posture–nursing task in farrowing crates (removing the small-object detection head) and accelerate it with TensorRT, evaluating on a random image-level split that they explicitly frame as within-facility performance. Class-imbalance mitigation—central to our setting—is absent from both formulations and, to our knowledge, neither study reports per-class accuracy on rare behaviors or generalization to unseen sequences.</w:t>
       </w:r>
-      <w:r>
-        <w:t xml:space="preserve"> Two very recent studies push the same deployment agenda with different emphases. PBR-YOLO [27] combines a GhostNet backbone, a FasterNet block with efficient multi-scale attention, and a lightweight multi-path head for eight piglet behaviors, reporting 15.8 ms per frame with TensorRT on a Jetson Orin NX—an attention-augmented design demonstrated on a board far more powerful than the Nano-class hardware we target. Rahman et al. [28] trim YOLO11n for the single posture–nursing task in farrowing crates (removing the small-object detection head) and accelerate it with TensorRT, evaluating on a random image-level split that they explicitly frame as within-facility performance. Class-imbalance mitigation, central to our setting, is not part of either formulation and, to our knowledge, neither reports per-class accuracy on rare behaviors or generalization to unseen sequences.</w:t>
-      </w:r>
+      <w:r/>
     </w:p>
     <w:p>
       <w:pPr>
@@ -165,11 +163,9 @@
         <w:rPr>
           <w:i w:val="0"/>
         </w:rPr>
-        <w:t>Relevant lightweight designs include depthwise-separable convolution (MobileNet [14]), feature-reuse convolution (GhostNet [15]), and partial convolution (FasterNet [16]), which performs spatial convolution on only a subset of channels to cut redundant memory access. Several agricultural studies deploy YOLO variants on Jetson-series boards with TensorRT acceleration and report encouraging frame rates [17, 18]. Still, on-device measurements remain rare in livestock behavior work, and two hardware facts are seldom discussed: Maxwell-generation boards such as the Jetson Nano have no native INT8 support, and TensorRT operator fusion can mask the theoretical advantages of lightweight operators at small model scales. We document both explicitly in Section 5.</w:t>
+        <w:t>Relevant lightweight designs include depthwise-separable convolution (MobileNet [14]), feature-reuse convolution (GhostNet [15]), and partial convolution (FasterNet [16]), which performs spatial convolution on only a subset of channels to cut redundant memory access. Several agricultural studies deploy YOLO variants on Jetson-series boards with TensorRT acceleration and report encouraging frame rates [17, 18]. Yet on-device measurements remain rare in livestock behavior work, and two hardware facts are almost never discussed: Maxwell-generation boards such as the Jetson Nano have no native INT8 support, and TensorRT operator fusion can mask the theoretical advantages of lightweight operators at small model scales. We document both explicitly in Section 5. FasterNet-based substitution is itself established—Guo et al. [31] integrated FasterNet into YOLOv8 for real-time underwater detection and YOLO-FGD [32] applied the same idea to PCB inspection, both in this journal—so our contribution is not the substitution but the condition under which it preserves accuracy: identity-preserving weight transfer (Section 3.5), which these works do not discuss. A complementary route to lightness is post-training compression: Luo et al. [33] combine channel pruning with knowledge distillation for piglet behavior recognition, accepting a small accuracy margin in exchange for large parameter cuts without changing the training-time architecture.</w:t>
       </w:r>
-      <w:r>
-        <w:t xml:space="preserve"> FasterNet-based substitution is itself established—Guo et al. [31] integrated FasterNet into YOLOv8 for real-time underwater detection and YOLO-FGD [32] applied the same idea to PCB inspection, both in this journal—so our contribution is not the substitution but the condition under which it preserves accuracy: identity-preserving weight transfer (Section 3.5), which these works do not discuss. A complementary route to lightness is post-training compression: Luo et al. [33] combine channel pruning with knowledge distillation for piglet behavior recognition, accepting a small accuracy margin in exchange for large parameter cuts without changing the training-time architecture.</w:t>
-      </w:r>
+      <w:r/>
     </w:p>
     <w:p>
       <w:pPr>
@@ -1224,7 +1220,7 @@
     </w:p>
     <w:p>
       <w:r>
-        <w:t>Table 3 walks through the design space in the order we actually explored it, including the failures. Two attention-integration attempts (M1, M2) are listed first: both degrade accuracy noticeably, and their diagnosis (Section 3.5) is what pushed us toward identity-preserving integration in the first place. The FasterNet substitution alone (M3) costs 2.7 test points at 4.4% fewer parameters; a warm-restart continuation experiment (100 + 100 epochs, lr0 = 0.002) recovered 2.95 points, confirming that the gap is partly an under-training artifact of the substituted blocks rather than a capacity ceiling. The sampling strategy alone (M4) is the single most effective modification: test mAP50 rises from 0.5964 to 0.6035 and validation recall from 0.605 to 0.626 (+2.1 points, validation set), with the largest gains on rare classes (Section 4.4; training dynamics in Fig. 3). The combined model (M5) lands at 0.5932—within 0.32 points of the baseline—while carrying 4.4% fewer parameters, and it is the model we deploy in Section 5. Finally, the negative control (M6) applies the same sampling strategy to YOLOv12n: accuracy drops from 0.6135 to 0.5994 (−1.4 points), i.e., the benefit of exposure re-balancing does not transfer to the attention-centric base. We read this as evidence that YOLOv12n is natively more robust to imbalance and that re-sampling pushes it toward over-fitting; it also retrospectively justifies our empirical choice of YOLOv11n as the base model for this dataset-and-method combination.</w:t>
+        <w:t>Table 3 walks through the design space in the order we actually explored it, including the failures. Two attention-integration attempts (M1, M2) are listed first: both degrade accuracy noticeably, and their diagnosis (Section 3.5) is what pushed us toward identity-preserving integration in the first place. The FasterNet substitution alone (M3) costs 2.7 test points at 4.4% fewer parameters; a warm-restart continuation experiment (100 + 100 epochs, lr0 = 0.002) recovered 2.95 points, confirming that the gap is partly an under-training artifact of the substituted blocks rather than a capacity ceiling. The sampling strategy alone (M4) is the single most effective modification: test mAP50 rises from 0.5964 to 0.6035 and validation recall from 0.605 to 0.626 (+2.1 points, validation set), with the largest gains on rare classes (Section 4.4; training dynamics in Fig. 3). The combined model (M5) lands at 0.5932—within 0.32 points of the baseline—while carrying 4.4% fewer parameters, and it is the model we deploy in Section 5. Finally, the negative control (M6) applies the same sampling strategy to YOLOv12n: accuracy drops from 0.6135 to 0.5994 (−1.4 points), i.e., the benefit of exposure re-balancing does not transfer to the attention-centric base. We read this as evidence that YOLOv12n is natively more robust to imbalance and that re-sampling pushes it toward over-fitting; it also retroactively supports our empirical choice of YOLOv11n as the base for this dataset-and-method combination.</w:t>
       </w:r>
     </w:p>
     <w:p>
@@ -1800,7 +1796,7 @@
     </w:p>
     <w:p>
       <w:r>
-        <w:t>Table 4 places the two adopted variants against the comparison set under identical training conditions. M4 (0.6035) outperforms YOLOv5n (0.6001), RT-DETR-l (0.6008), YOLOv8n (0.5877), and the unmodified YOLOv11n baseline (0.5964), ranking second only to YOLOv12n (0.6135). M5 reaches 0.5932 at 2.47M parameters: it exceeds YOLOv8n while being 18% smaller, and it approaches RT-DETR-l at roughly one-thirteenth of the parameters and one-sixteenth of the FLOPs—a relevant operating point when the target hardware is a 5-watt edge board rather than a server GPU. Two observations are worth noting. First, YOLOv8n scores above our baseline on the validation split but below it on the test split, a reminder that validation rankings do not always survive contact with held-out data. Second, although YOLOv12n is the accuracy leader on this dataset, it is also the slowest model we benchmarked (Section 4.6), and—as M6 shows—it does not benefit from our sampling strategy; for an edge-oriented framework, we therefore regard it as a strong server-side reference rather than a deployment candidate.</w:t>
+        <w:t>Table 4 places the two adopted variants against the comparison set under identical training conditions. M4 (0.6035) outperforms YOLOv5n (0.6001), RT-DETR-l (0.6008), YOLOv8n (0.5877), and the unmodified YOLOv11n baseline (0.5964), ranking second only to YOLOv12n (0.6135). M5 reaches 0.5932 at 2.47M parameters: it exceeds YOLOv8n while being 18% smaller, and it approaches RT-DETR-l at roughly one-thirteenth of the parameters and one-sixteenth of the FLOPs—a relevant operating point when the target hardware is a 5-watt edge board rather than a server GPU. Two observations stand out. First, YOLOv8n scores above our baseline on the validation split but below it on the test split, a reminder that validation rankings do not always survive contact with held-out data. Second, although YOLOv12n is the accuracy leader on this dataset, it is also the slowest model we benchmarked (Section 4.6), and—as M6 shows—it does not benefit from our sampling strategy; for an edge-oriented framework, we therefore regard it as a strong server-side reference rather than a deployment candidate.</w:t>
       </w:r>
     </w:p>
     <w:p>
@@ -2270,7 +2266,7 @@
         <w:rPr>
           <w:i w:val="0"/>
         </w:rPr>
-        <w:t>Single training runs of small detectors can easily fluctuate by half a point, so we repeated the baseline and the two adopted models with three different seeds. The baseline scores 0.5822 ± 0.0087 on validation and 0.6060 ± 0.0084 on test (seed 0 exactly reproduces the 0.5964 single run reported in Table 3). M4 scores 0.5790 ± 0.0054 on validation and 0.5987 ± 0.0062 on test; M5 scores 0.5620 ± 0.0079 and 0.5904 ± 0.0086, respectively. Against the three-seed baseline test mean, the M5 difference (−0.016) amounts to about two standard errors of the seed-to-seed variation and is not significant at the 0.05 level (two-sample t-test, p ≈ 0.09), so we report M5 as statistically comparable to the baseline rather than superior to it. The M4 test mean sits within one baseline standard deviation (−0.007)—its real value, shown in Section 4.4, is the redistribution of accuracy toward rare, welfare-relevant behaviors and the +2.1-point recall gain on validation, not a headline mAP increase. We deliberately present it this way: an overall-gain framing would not survive a careful reviewer, and the rare-class framing is both honest and, for welfare alerting, the practically relevant one.</w:t>
+        <w:t>Single training runs of small detectors can easily fluctuate by half a point, so we repeated the baseline and the two adopted models with three different seeds. The baseline scores 0.5822 ± 0.0087 on validation and 0.6060 ± 0.0084 on test (seed 0 exactly reproduces the 0.5964 single run reported in Table 3). M4 scores 0.5790 ± 0.0054 on validation and 0.5987 ± 0.0062 on test; M5 scores 0.5620 ± 0.0079 and 0.5904 ± 0.0086, respectively. Against the three-seed baseline test mean, the M5 difference (−0.016) amounts to about two standard errors of the seed-to-seed variation and is not significant at the 0.05 level (two-sample t-test, p ≈ 0.09), so we report M5 as statistically comparable to the baseline rather than superior to it. The M4 test mean sits within one baseline standard deviation (−0.007)—its real value, shown in Section 4.4, is the redistribution of accuracy toward rare, welfare-relevant behaviors and the +2.1-point recall gain on validation, not a headline mAP increase. We deliberately present it this way: an overall-gain framing would overstate the evidence, while the rare-class framing is both honest and, for welfare alerting, the practically relevant one.</w:t>
       </w:r>
     </w:p>
     <w:p>
@@ -2283,7 +2279,7 @@
     </w:p>
     <w:p>
       <w:r>
-        <w:t>Table 5 reports efficiency on the RTX 3090 (FP32, batch 1, 640×640). M5 is the fastest model in the entire comparison at 117.6 FPS (Fig. 4)—ahead of the baseline (112.8) and M4 (112.1), and 50% ahead of YOLOv12n (78.4). One boundary should be stated plainly: the efficiency gain shows up in parameter count (−4.4%) and measured speed, not in FLOPs, which stay essentially flat (6.3G → 6.5G). This is expected rather than contradictory. FLOPs count arithmetic operations, while partial convolution mainly cuts redundant memory access; latency benchmarks capture the latter, the FLOPs counter does not. The same caveat will reappear, in amplified form, on the Jetson Nano (Section 5), where TensorRT operator fusion absorbs most of the remaining difference.</w:t>
+        <w:t>Table 5 reports efficiency on the RTX 3090 (FP32, batch 1, 640×640). M5 is the fastest model in the entire comparison at 117.6 FPS (Fig. 4)—ahead of the baseline (112.8) and M4 (112.1), and 50% ahead of YOLOv12n (78.4). One boundary deserves to be stated plainly: the efficiency gain shows up in parameter count (−4.4%) and measured speed, not in FLOPs, which stay essentially flat (6.3G → 6.5G). This is expected, not contradictory. FLOPs count arithmetic operations, while partial convolution mainly cuts redundant memory access; latency benchmarks capture the latter, the FLOPs counter does not. The same caveat will reappear, in amplified form, on the Jetson Nano (Section 5), where TensorRT operator fusion absorbs most of the remaining difference.</w:t>
       </w:r>
     </w:p>
     <w:p>
@@ -2721,7 +2717,7 @@
     </w:p>
     <w:p>
       <w:r>
-        <w:t>Three practical findings from the deployment work are reported because they are rarely documented in this literature and each cost us real time. First, INT8 quantization is effectively unavailable on this board: the Maxwell GPU has no native INT8 units and TensorRT 8.2 calibration fails on it, so FP16 is the practical precision floor for Nano-class hardware; buyers of new hardware should budget for an Orin-class board if INT8 is needed. Second, the on-device latency difference between M5 and the baseline is under 2%—TensorRT operator fusion absorbs the partial-convolution advantage at this model scale, so the server-side speed gap (Table 5) does not carry over to the edge. The honest claim is therefore parity on the Nano with a smaller model, not a speed win. Third, the build toolchain is fragile in ways worth knowing before fieldwork: an interrupted onnxslim simplification left a silently corrupted ONNX file that only surfaced at engine-build time, and a subsequent run of build failures reported misleading cuDNN symbol errors that a reboot cleared (stale GPU state from the crashed build). Exporting without graph simplification and running one engine build at a time, with a reboot after any crashed build, made the pipeline reproducible. None of these issues appear in server-side evaluations, which is precisely why we report them here.</w:t>
+        <w:t>We report three practical findings from the deployment work because they are rarely documented in this literature and each one cost us real time. First, INT8 quantization is effectively unavailable on this board: the Maxwell GPU has no native INT8 units and TensorRT 8.2 calibration fails on it, so FP16 is the practical precision floor for Nano-class hardware; buyers of new hardware should budget for an Orin-class board if INT8 is needed. Second, the on-device latency difference between M5 and the baseline is under 2%—TensorRT operator fusion absorbs the partial-convolution advantage at this model scale, so the server-side speed gap (Table 5) does not carry over to the edge. The honest claim is therefore parity on the Nano with a smaller model, not a speed win. Third, the build toolchain is fragile in ways worth knowing before fieldwork: an interrupted onnxslim simplification left a silently corrupted ONNX file that only surfaced at engine-build time, and a subsequent run of build failures reported misleading cuDNN symbol errors that a reboot cleared (stale GPU state from the crashed build). Exporting without graph simplification and running one engine build at a time, with a reboot after any crashed build, made the pipeline reproducible. None of these issues appear in server-side evaluations, which is precisely why we report them here.</w:t>
       </w:r>
     </w:p>
     <w:p>
@@ -3274,7 +3270,7 @@
         <w:rPr>
           <w:i w:val="0"/>
         </w:rPr>
-        <w:t>This paper presented a lightweight, real-time multi-behavior detection framework for group-housed pigs that combines class-imbalance-aware sampling with a FasterNet backbone substitution under an identity-preserving integration strategy. On a public ten-class dataset, the framework lifts the average precision of the low-frequency behavior active by 11.3 points on the held-out test set and validation recall by 2.1 points, keeps overall accuracy statistically comparable to the YOLOv11n baseline across three repeated runs, reduces parameters by 4.4%, and is the fastest of all benchmarked detectors on the server GPU (117.6 FPS). On-device validation on a Jetson Nano confirms real-time operation (19.7 FPS at 640×640; 33.3 FPS at 480×480) at approximately 5 W. A two-level generalization analysis—an unseen-sequence stress test and zero-shot evaluation on an independent farm dataset—delineates the operating envelope honestly: the framework is ready for same-farm deployment today, and it identifies domain adaptation and multi-farm data collection as the key directions for cross-farm operation tomorrow.</w:t>
+        <w:t>This paper presented a lightweight, real-time multi-behavior detection framework for group-housed pigs that combines class-imbalance-aware sampling with a FasterNet backbone substitution under an identity-preserving integration strategy. On a public ten-class dataset, the framework lifts the average precision of the low-frequency behavior active by 11.3 points on the held-out test set and validation recall by 2.1 points, keeps overall accuracy statistically comparable to the YOLOv11n baseline across three repeated runs, reduces parameters by 4.4%, and is the fastest of all benchmarked detectors on the server GPU (117.6 FPS). On-device validation on a Jetson Nano confirms real-time operation (19.7 FPS at 640×640; 33.3 FPS at 480×480) at approximately 5 W. A two-level generalization analysis—an unseen-sequence stress test and zero-shot evaluation on an independent farm dataset—maps the operating envelope without embellishment: the framework is ready for same-farm deployment today, with domain adaptation and multi-farm data collection as the key directions for cross-farm operation tomorrow.</w:t>
       </w:r>
     </w:p>
     <w:p>

</xml_diff>

<commit_message>
Add latency breakdown + sustained-operation measurements to v5 (EN/ZH): three-stage latency split, 10.7min thermal stability (20.0 FPS, no throttling), rail power 3.4W idle / ~7W sustained (~5W compute rails); correct ~5W wording; add nano bench scripts + thermal logs
</commit_message>
<xml_diff>
--- a/paper/JRTIP-paper-v5.docx
+++ b/paper/JRTIP-paper-v5.docx
@@ -31,7 +31,7 @@
         <w:rPr>
           <w:i w:val="0"/>
         </w:rPr>
-        <w:t>Automated monitoring of group-housed pigs calls for detectors that are accurate on rare, welfare-relevant behaviors yet fast enough for low-cost edge hardware. We built a real-time multi-behavior detection framework on YOLOv11n and validated it on a Jetson Nano, and three design choices carry the result. First, a class-imbalance-aware sampling strategy based on frequency-capped offline oversampling improves rare-class detection without touching the network: the average precision of the low-frequency behavior active rises from 0.526 to 0.639 on the test set, and overall recall improves by 2.1 points on the validation set. Second, a FasterNet backbone substitution—paired with an identity-preserving integration strategy that transfers pre-trained weights by index-aligned remapping—cuts parameters by 4.4% while keeping accuracy statistically comparable to the baseline across three repeated runs (test mean average precision at IoU 0.5 (mAP50) of 0.590 ± 0.009 vs. a three-seed baseline of 0.606 ± 0.008); it is also, unexpectedly, the fastest model we benchmarked (117.6 frames per second (FPS) on an RTX 3090). Third, on-device validation on the Nano confirms real-time operation (19.7 FPS at 640×640; 33.3 FPS at 480×480) at roughly 5 W total power. A two-level generalization analysis—an unseen-sequence stress test and an independent farm dataset—closes the loop by marking out where the framework works and where it does not.</w:t>
+        <w:t>Automated monitoring of group-housed pigs calls for detectors that are accurate on rare, welfare-relevant behaviors yet fast enough for low-cost edge hardware. We built a real-time multi-behavior detection framework on YOLOv11n and validated it on a Jetson Nano, and three design choices carry the result. First, a class-imbalance-aware sampling strategy based on frequency-capped offline oversampling improves rare-class detection without touching the network: the average precision of the low-frequency behavior active rises from 0.526 to 0.639 on the test set, and overall recall improves by 2.1 points on the validation set. Second, a FasterNet backbone substitution—paired with an identity-preserving integration strategy that transfers pre-trained weights by index-aligned remapping—cuts parameters by 4.4% while keeping accuracy statistically comparable to the baseline across three repeated runs (test mean average precision at IoU 0.5 (mAP50) of 0.590 ± 0.009 vs. a three-seed baseline of 0.606 ± 0.008); it is also, unexpectedly, the fastest model we benchmarked (117.6 frames per second (FPS) on an RTX 3090). Third, on-device validation on the Nano confirms real-time operation (19.7 FPS at 640×640; 33.3 FPS at 480×480) at roughly 7 W total board power (≈5 W across the compute rails). A two-level generalization analysis—an unseen-sequence stress test and an independent farm dataset—closes the loop by marking out where the framework works and where it does not.</w:t>
       </w:r>
     </w:p>
     <w:p>
@@ -103,7 +103,7 @@
         <w:rPr>
           <w:i w:val="0"/>
         </w:rPr>
-        <w:t>(3) A deployment validation on Jetson Nano (19.7–33.3 FPS at ≈5 W) and a two-level generalization analysis (unseen sequences; an independent farm dataset) that delimit the operating envelope of the framework.</w:t>
+        <w:t>(3) A deployment validation on Jetson Nano (19.7–33.3 FPS at ≈7 W board power) and a two-level generalization analysis (unseen sequences; an independent farm dataset) that delimit the operating envelope of the framework.</w:t>
       </w:r>
     </w:p>
     <w:p>
@@ -2668,7 +2668,7 @@
     </w:p>
     <w:p>
       <w:r>
-        <w:t>A detector that only runs on a server GPU does not solve the barn-side problem stated in the introduction, so we validated the full deployment pipeline on a Jetson Nano (4 GB, Maxwell GPU, JetPack 4.6.3, TensorRT 8.2)—a board that retails for roughly the price of a single farrowing crate sensor. The pipeline is PyTorch → ONNX (opset 12) → TensorRT FP16 (Fig. 7). The exported artifacts are small: the M5 checkpoint is 5.2 MB (baseline 5.5 MB) and the ONNX export 10.1 MB, so rolling updates to barn devices are cheap. M5 sustains 50.2 ms per frame (19.7 FPS) at 640×640 and 30.0 ms (33.3 FPS) at 480×480—essentially matching the baseline (50.8 ms/19.7 FPS and 29.9 ms/33.4 FPS)—with the whole board drawing approximately 5 W under load. Both operating points are real-time for behavior monitoring, whose events unfold over seconds; the 480×480 point leaves headroom for multi-stream or multi-model pipelines on the same board.</w:t>
+        <w:t>A detector that only runs on a server GPU does not solve the barn-side problem stated in the introduction, so we validated the full deployment pipeline on a Jetson Nano (4 GB, Maxwell GPU, JetPack 4.6.3, TensorRT 8.2)—a board that retails for roughly the price of a single farrowing crate sensor. The pipeline is PyTorch → ONNX (opset 12) → TensorRT FP16 (Fig. 7). The exported artifacts are small: the M5 checkpoint is 5.2 MB (baseline 5.5 MB) and the ONNX export 10.1 MB, so rolling updates to barn devices are cheap. M5 sustains 50.2 ms per frame (19.7 FPS) at 640×640 and 30.0 ms (33.3 FPS) at 480×480—essentially matching the baseline (50.8 ms/19.7 FPS and 29.9 ms/33.4 FPS)—with the whole board drawing ≈7 W under sustained load (rail-level breakdown below). Both operating points are real-time for behavior monitoring, whose events unfold over seconds; the 480×480 point leaves headroom for multi-stream or multi-model pipelines on the same board.</w:t>
       </w:r>
     </w:p>
     <w:p>
@@ -2718,6 +2718,12 @@
     <w:p>
       <w:r>
         <w:t>We report three practical findings from the deployment work because they are rarely documented in this literature and each one cost us real time. First, INT8 quantization is effectively unavailable on this board: the Maxwell GPU has no native INT8 units and TensorRT 8.2 calibration fails on it, so FP16 is the practical precision floor for Nano-class hardware; buyers of new hardware should budget for an Orin-class board if INT8 is needed. Second, the on-device latency difference between M5 and the baseline is under 2%—TensorRT operator fusion absorbs the partial-convolution advantage at this model scale, so the server-side speed gap (Table 5) does not carry over to the edge. The honest claim is therefore parity on the Nano with a smaller model, not a speed win. Third, the build toolchain is fragile in ways worth knowing before fieldwork: an interrupted onnxslim simplification left a silently corrupted ONNX file that only surfaced at engine-build time, and a subsequent run of build failures reported misleading cuDNN symbol errors that a reboot cleared (stale GPU state from the crashed build). Exporting without graph simplification and running one engine build at a time, with a reboot after any crashed build, made the pipeline reproducible. None of these issues appear in server-side evaluations, which is precisely why we report them here.</w:t>
+      </w:r>
+    </w:p>
+    <w:p>
+      <w:pPr/>
+      <w:r>
+        <w:t>Three further measurements delimit the real-time claim. First, the latency budget decomposes cleanly at 640×640: host-to-device transfer costs 0.48 ms, GPU compute 49.6 ms, and device-to-host 0.06 ms—and the engine is therefore not the bottleneck to watch. The CPU side is: a pure-Python pre/post pipeline would exceed the GPU time (JPEG decode and resize cost 17.1 ms from a 640×640 source and 107.9 ms from a 1080p source; normalize and layout conversion cost 6.8 ms in optimized C; NMS over ≈370 candidates costs 0.5 ms), and TensorRT enqueue overhead adds 9.5–10.4 ms, so production pipelines should implement pre/post-processing in C or CUDA. Second, sustained operation is stable: over 12,000 consecutive inferences (10.7 min), throughput held at 20.0 FPS with a 99th-percentile latency of 51.3 ms, GPU temperature peaked at 55.5 °C, and no thermal-throttling event or clock drop occurred. Third, rail-level measurements (INA3221) show 3.4 W at idle and ≈7.0 W total board input under sustained load, of which ≈5.0 W falls on the GPU and CPU rails—this is the figure headlined above.</w:t>
       </w:r>
     </w:p>
     <w:p>
@@ -3270,7 +3276,7 @@
         <w:rPr>
           <w:i w:val="0"/>
         </w:rPr>
-        <w:t>This paper presented a lightweight, real-time multi-behavior detection framework for group-housed pigs that combines class-imbalance-aware sampling with a FasterNet backbone substitution under an identity-preserving integration strategy. On a public ten-class dataset, the framework lifts the average precision of the low-frequency behavior active by 11.3 points on the held-out test set and validation recall by 2.1 points, keeps overall accuracy statistically comparable to the YOLOv11n baseline across three repeated runs, reduces parameters by 4.4%, and is the fastest of all benchmarked detectors on the server GPU (117.6 FPS). On-device validation on a Jetson Nano confirms real-time operation (19.7 FPS at 640×640; 33.3 FPS at 480×480) at approximately 5 W. A two-level generalization analysis—an unseen-sequence stress test and zero-shot evaluation on an independent farm dataset—maps the operating envelope without embellishment: the framework is ready for same-farm deployment today, with domain adaptation and multi-farm data collection as the key directions for cross-farm operation tomorrow.</w:t>
+        <w:t>This paper presented a lightweight, real-time multi-behavior detection framework for group-housed pigs that combines class-imbalance-aware sampling with a FasterNet backbone substitution under an identity-preserving integration strategy. On a public ten-class dataset, the framework lifts the average precision of the low-frequency behavior active by 11.3 points on the held-out test set and validation recall by 2.1 points, keeps overall accuracy statistically comparable to the YOLOv11n baseline across three repeated runs, reduces parameters by 4.4%, and is the fastest of all benchmarked detectors on the server GPU (117.6 FPS). On-device validation on a Jetson Nano confirms real-time operation (19.7 FPS at 640×640; 33.3 FPS at 480×480) at approximately 7 W total power. A two-level generalization analysis—an unseen-sequence stress test and zero-shot evaluation on an independent farm dataset—maps the operating envelope without embellishment: the framework is ready for same-farm deployment today, with domain adaptation and multi-farm data collection as the key directions for cross-farm operation tomorrow.</w:t>
       </w:r>
     </w:p>
     <w:p>

</xml_diff>

<commit_message>
Close review board #8 residuals: verify [31][32] no-weight-transfer claim (TLDR-level), add annotation-protocol attribution + alert-path sentences to EN/ZH v5, still 10/12 pages
</commit_message>
<xml_diff>
--- a/paper/JRTIP-paper-v5.docx
+++ b/paper/JRTIP-paper-v5.docx
@@ -188,7 +188,7 @@
         <w:rPr>
           <w:i w:val="0"/>
         </w:rPr>
-        <w:t>We use a public group-housed pig behavior dataset (Roboflow Universe, CC BY 4.0 [19]) derived from the publicly documented acquisition of Bergamini et al. [20], recorded in commercial pig barns with fixed overhead cameras under natural daylight. The dataset contains 5,620 images and 13,995 annotated instances over ten behaviors, captured as top-down or oblique pen views. Breed and age information is not provided in the public dataset. We keep the publisher split (3,936/1,123/561 images for train/validation/test). Annotation quality was verified by visual inspection of a random sample of the training images. The study uses only publicly available, non-invasively acquired data; no animal experiments were performed and no ethics approval was required. Table 1 defines the ten behaviors and summarizes their instance distribution, and Fig. 1 visualizes it together with the duplication factors it induces (Section 3.3).</w:t>
+        <w:t>We use a public group-housed pig behavior dataset (Roboflow Universe, CC BY 4.0 [19]) derived from the publicly documented acquisition of Bergamini et al. [20], recorded in commercial pig barns with fixed overhead cameras under natural daylight. The dataset contains 5,620 images and 13,995 annotated instances over ten behaviors, captured as top-down or oblique pen views. Breed and age information is not provided in the public dataset. We keep the publisher split (3,936/1,123/561 images for train/validation/test). Behavior definitions and the annotation protocol follow the original acquisition study [20]; annotation quality was additionally verified by visual inspection of a random sample of the training images. The study uses only publicly available, non-invasively acquired data; no animal experiments were performed and no ethics approval was required. Table 1 defines the ten behaviors and summarizes their instance distribution, and Fig. 1 visualizes it together with the duplication factors it induces (Section 3.3).</w:t>
       </w:r>
     </w:p>
     <w:p>
@@ -3260,7 +3260,7 @@
         <w:rPr>
           <w:i w:val="0"/>
         </w:rPr>
-        <w:t>Limitations. The rarest class (sitting, 144 instances) remains weak under every model and split; more rare-class footage, not better architectures, is the fix. The framework is evaluated on a single source dataset recorded in daylight under fixed cameras; night vision, farrowing crates, and outdoor pens are out of scope. Cross-farm and cross-breed generalization is unsolved (Section 6). INT8 acceleration requires newer edge hardware than the Maxwell-generation Nano. Finally, behavior labels are frame-level and instantaneous. We evaluated a lightweight temporal post-process (IoU track matching with majority class voting) on the validation set and found no accuracy gain: the benchmark frames are sparsely sampled tens to hundreds of frames apart, so track matching breaks across the temporal gaps and voting corrupts correct single-frame labels. Temporal integration remains promising for dense-frame live video—precisely the deployment regime of Section 5—together with domain adaptation and multi-farm data collection.</w:t>
+        <w:t>Limitations. The rarest class (sitting, 144 instances) remains weak under every model and split; more rare-class footage, not better architectures, is the fix. The framework is evaluated on a single source dataset recorded in daylight under fixed cameras; night vision, farrowing crates, and outdoor pens are out of scope. Cross-farm and cross-breed generalization is unsolved (Section 6). INT8 acceleration requires newer edge hardware than the Maxwell-generation Nano. Finally, behavior labels are frame-level and instantaneous. We evaluated a lightweight temporal post-process (IoU track matching with majority class voting) on the validation set and found no accuracy gain: the benchmark frames are sparsely sampled tens to hundreds of frames apart, so track matching breaks across the temporal gaps and voting corrupts correct single-frame labels. On the alert side, per-frame labels aggregate naturally into pen-level statistics—fight frequency, lying-time share, drink-visit counts—over which simple threshold rules can raise welfare alerts; tuning those thresholds is farm-specific and belongs to deployment work. Temporal integration remains promising for dense-frame live video—precisely the deployment regime of Section 5—together with domain adaptation and multi-farm data collection.</w:t>
       </w:r>
     </w:p>
     <w:p>

</xml_diff>

<commit_message>
Add supplementary figures S1-S3 (PR curves, latency breakdown, sustained-operation timeline) with main-text pointers; rebuild ESM_1.pdf; still 10/12 pages
</commit_message>
<xml_diff>
--- a/paper/JRTIP-paper-v5.docx
+++ b/paper/JRTIP-paper-v5.docx
@@ -2252,6 +2252,9 @@
       <w:r>
         <w:t xml:space="preserve"> Per-class AP50 on the held-out test set for the baseline, M4 and M5 is reported in Table S2 in Online Resource 1; the rare-class pattern mirrors the validation set.</w:t>
       </w:r>
+      <w:r>
+        <w:t xml:space="preserve"> Precision–recall curves for the deployment pair are provided in Fig. S1.</w:t>
+      </w:r>
     </w:p>
     <w:p>
       <w:pPr>
@@ -2724,6 +2727,9 @@
       <w:pPr/>
       <w:r>
         <w:t>Three further measurements delimit the real-time claim. First, the latency budget decomposes cleanly at 640×640: host-to-device transfer costs 0.48 ms, GPU compute 49.6 ms, and device-to-host 0.06 ms—and the engine is therefore not the bottleneck to watch. The CPU side is: a pure-Python pre/post pipeline would exceed the GPU time (JPEG decode and resize cost 17.1 ms from a 640×640 source and 107.9 ms from a 1080p source; normalize and layout conversion cost 6.8 ms in optimized C; NMS over ≈370 candidates costs 0.5 ms), and TensorRT enqueue overhead adds 9.5–10.4 ms, so production pipelines should implement pre/post-processing in C or CUDA. Second, sustained operation is stable: over 12,000 consecutive inferences (10.7 min), throughput held at 20.0 FPS with a 99th-percentile latency of 51.3 ms, GPU temperature peaked at 55.5 °C, and no thermal-throttling event or clock drop occurred. Third, rail-level measurements (INA3221) show 3.4 W at idle and ≈7.0 W total board input under sustained load, of which ≈5.0 W falls on the GPU and CPU rails—this is the figure headlined above.</w:t>
+      </w:r>
+      <w:r>
+        <w:t xml:space="preserve"> The full breakdown and the sustained-operation timeline are visualized in Figs. S2 and S3.</w:t>
       </w:r>
     </w:p>
     <w:p>

</xml_diff>

<commit_message>
Fill author info (Zhan Zhang & Linlin Gou, co-first, Liupanshui Normal University), bios, CRediT contributions, no-funding statement; cover letter synced; audit 25P/0F/0M; still 10 pages
</commit_message>
<xml_diff>
--- a/paper/JRTIP-paper-v5.docx
+++ b/paper/JRTIP-paper-v5.docx
@@ -11,11 +11,44 @@
       </w:r>
     </w:p>
     <w:p>
+      <w:pPr>
+        <w:jc w:val="center"/>
+      </w:pPr>
       <w:r>
         <w:rPr>
           <w:i/>
         </w:rPr>
-        <w:t>[Authors / affiliations to be filled]</w:t>
+      </w:r>
+      <w:r>
+        <w:rPr>
+          <w:i w:val="0"/>
+          <w:sz w:val="24"/>
+        </w:rPr>
+        <w:t>Zhan Zhang†* and Linlin Gou†</w:t>
+      </w:r>
+      <w:r>
+        <w:rPr>
+          <w:i w:val="0"/>
+          <w:sz w:val="20"/>
+        </w:rPr>
+        <w:br/>
+        <w:t>School of Biological Science and Technology, Liupanshui Normal University, Liupanshui 553000, China</w:t>
+      </w:r>
+      <w:r>
+        <w:rPr>
+          <w:i w:val="0"/>
+          <w:sz w:val="20"/>
+        </w:rPr>
+        <w:br/>
+        <w:t>† These authors contributed equally to this work.</w:t>
+      </w:r>
+      <w:r>
+        <w:rPr>
+          <w:i w:val="0"/>
+          <w:sz w:val="20"/>
+        </w:rPr>
+        <w:br/>
+        <w:t>*Corresponding author: Zhan Zhang, e-mail: 851709772@qq.com</w:t>
       </w:r>
     </w:p>
     <w:p>
@@ -3298,7 +3331,7 @@
         <w:rPr>
           <w:i w:val="0"/>
         </w:rPr>
-        <w:t>Author Contributions: [to be completed by the authors].</w:t>
+        <w:t>Author Contributions: Z.Z. and L.G. contributed equally to this work: conceptualization, methodology, software, validation, formal analysis, investigation, data curation, writing—original draft, writing—review and editing, and visualization.</w:t>
       </w:r>
     </w:p>
     <w:p>
@@ -3306,7 +3339,7 @@
         <w:rPr>
           <w:i w:val="0"/>
         </w:rPr>
-        <w:t>Funding: [to be completed by the authors].</w:t>
+        <w:t>Funding: The authors received no specific funding for this work.</w:t>
       </w:r>
     </w:p>
     <w:p>
@@ -3678,6 +3711,22 @@
         <w:t>[33] Luo, Y., Lin, K., Xiao, Z., et al.: Collaborative optimization of model pruning and knowledge distillation for efficient and lightweight multi-behavior recognition in piglets. Animals 15(11), 1563 (2025). https://doi.org/10.3390/ani15111563</w:t>
       </w:r>
     </w:p>
+    <w:p>
+      <w:r>
+        <w:rPr>
+          <w:sz w:val="18"/>
+        </w:rPr>
+        <w:t>Zhan Zhang is a third-year undergraduate student majoring in Animal Science at the School of Biological Science and Technology, Liupanshui Normal University, Liupanshui, China. Research interests include computer vision, edge computing, and their applications to precision livestock farming. This is a first peer-reviewed publication.</w:t>
+      </w:r>
+    </w:p>
+    <w:p>
+      <w:r>
+        <w:rPr>
+          <w:sz w:val="18"/>
+        </w:rPr>
+        <w:t>Linlin Gou is an undergraduate student at the School of Biological Science and Technology, Liupanshui Normal University, Liupanshui, China. Research interests include animal science and applied machine learning.</w:t>
+      </w:r>
+    </w:p>
     <w:sectPr>
       <w:pgSz w:w="12240" w:h="15840"/>
       <w:pgMar w:top="1440" w:right="1800" w:bottom="1440" w:left="1800" w:header="720" w:footer="720" w:gutter="0"/>

</xml_diff>